<commit_message>
docs: cap nhat vai tro thanh vien trong nhom
</commit_message>
<xml_diff>
--- a/docs/Nhom-HomeCredit-tailieubaocao.docx
+++ b/docs/Nhom-HomeCredit-tailieubaocao.docx
@@ -22,16 +22,16 @@
         <mc:AlternateContent>
           <mc:Choice Requires="wpg">
             <w:drawing>
-              <wp:anchor distT="0" distB="0" distL="114300" distR="114300" simplePos="0" relativeHeight="251668992" behindDoc="0" locked="0" layoutInCell="1" allowOverlap="1" wp14:anchorId="5A5A71CA" wp14:editId="5ACC3450">
+              <wp:anchor distT="0" distB="0" distL="114300" distR="114300" simplePos="0" relativeHeight="251668992" behindDoc="0" locked="0" layoutInCell="1" allowOverlap="1" wp14:anchorId="5A5A71CA" wp14:editId="06E82B7F">
                 <wp:simplePos x="0" y="0"/>
                 <wp:positionH relativeFrom="margin">
-                  <wp:align>left</wp:align>
+                  <wp:posOffset>4156</wp:posOffset>
                 </wp:positionH>
                 <wp:positionV relativeFrom="paragraph">
-                  <wp:posOffset>-119270</wp:posOffset>
+                  <wp:posOffset>-133004</wp:posOffset>
                 </wp:positionV>
-                <wp:extent cx="6444532" cy="9486900"/>
-                <wp:effectExtent l="0" t="0" r="13970" b="19050"/>
+                <wp:extent cx="6444532" cy="9653155"/>
+                <wp:effectExtent l="0" t="0" r="13970" b="24765"/>
                 <wp:wrapNone/>
                 <wp:docPr id="1782528655" name="Group 26"/>
                 <wp:cNvGraphicFramePr/>
@@ -42,7 +42,7 @@
                       <wpg:grpSpPr>
                         <a:xfrm>
                           <a:off x="0" y="0"/>
-                          <a:ext cx="6444532" cy="9486900"/>
+                          <a:ext cx="6444532" cy="9653155"/>
                           <a:chOff x="0" y="0"/>
                           <a:chExt cx="5863535" cy="9486900"/>
                         </a:xfrm>
@@ -393,12 +393,15 @@
                 <wp14:sizeRelH relativeFrom="margin">
                   <wp14:pctWidth>0</wp14:pctWidth>
                 </wp14:sizeRelH>
+                <wp14:sizeRelV relativeFrom="margin">
+                  <wp14:pctHeight>0</wp14:pctHeight>
+                </wp14:sizeRelV>
               </wp:anchor>
             </w:drawing>
           </mc:Choice>
-          <mc:Fallback xmlns:w16sdtfl="http://schemas.microsoft.com/office/word/2024/wordml/sdtformatlock" xmlns:w16du="http://schemas.microsoft.com/office/word/2023/wordml/word16du">
+          <mc:Fallback>
             <w:pict>
-              <v:group w14:anchorId="7B3222B4" id="Group 26" o:spid="_x0000_s1026" style="position:absolute;margin-left:0;margin-top:-9.4pt;width:507.45pt;height:747pt;z-index:251668992;mso-position-horizontal:left;mso-position-horizontal-relative:margin;mso-width-relative:margin" coordsize="58635,94869" o:gfxdata="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">
+              <v:group w14:anchorId="76335012" id="Group 26" o:spid="_x0000_s1026" style="position:absolute;margin-left:.35pt;margin-top:-10.45pt;width:507.45pt;height:760.1pt;z-index:251668992;mso-position-horizontal-relative:margin;mso-width-relative:margin;mso-height-relative:margin" coordsize="58635,94869" o:gfxdata="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">
                 <v:shape id="FreeForm 22" o:spid="_x0000_s1027" style="position:absolute;left:-47203;top:47203;width:94869;height:463;rotation:-90;visibility:visible;mso-wrap-style:square;v-text-anchor:top" coordsize="8662,111" o:gfxdata="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" path="m48,111l,,8662,r-40,111l48,111xe" fillcolor="#b0b0b0" strokeweight="1.5pt">
                   <v:path arrowok="t" o:connecttype="custom" o:connectlocs="57577444,19358433;0,0;2147483646,0;2147483646,19358433;57577444,19358433" o:connectangles="0,0,0,0,0"/>
                 </v:shape>
@@ -676,7 +679,7 @@
               </wp:anchor>
             </w:drawing>
           </mc:Choice>
-          <mc:Fallback xmlns:w16sdtfl="http://schemas.microsoft.com/office/word/2024/wordml/sdtformatlock" xmlns:w16du="http://schemas.microsoft.com/office/word/2023/wordml/word16du">
+          <mc:Fallback xmlns:w16du="http://schemas.microsoft.com/office/word/2023/wordml/word16du" xmlns:w16sdtfl="http://schemas.microsoft.com/office/word/2024/wordml/sdtformatlock">
             <w:pict>
               <v:shape w14:anchorId="04DAE31C" id="FreeForm 21" o:spid="_x0000_s1026" style="position:absolute;margin-left:428.35pt;margin-top:3.75pt;width:22.65pt;height:20.2pt;rotation:-90;z-index:251654656;visibility:visible;mso-wrap-style:square;mso-width-percent:0;mso-height-percent:0;mso-wrap-distance-left:9pt;mso-wrap-distance-top:0;mso-wrap-distance-right:9pt;mso-wrap-distance-bottom:0;mso-position-horizontal:absolute;mso-position-horizontal-relative:text;mso-position-vertical:absolute;mso-position-vertical-relative:text;mso-width-percent:0;mso-height-percent:0;mso-width-relative:page;mso-height-relative:page;v-text-anchor:top" coordsize="263,613" o:gfxdata="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" path="m,19l16,56r32,74l128,316r79,186l239,576r16,37l263,594r,-37l239,390r,-74l247,260r,-18l239,242,191,223,136,167,72,93,24,19,,,,19xe" strokecolor="white" strokeweight="1.5pt">
                 <v:path arrowok="t" o:connecttype="custom" o:connectlocs="0,3327487;19140542,9807947;57421625,22768448;153123241,55344843;247629393,87921238;285910476,100881739;305051018,107361781;314621289,104034294;314621289,97553834;285910476,68305344;285910476,55344843;295480747,45536896;295480747,42384342;285910476,42384342;228488851,39056436;162693512,29248489;86132438,16287988;28710813,3327487;0,0;0,3327487" o:connectangles="0,0,0,0,0,0,0,0,0,0,0,0,0,0,0,0,0,0,0,0"/>
@@ -896,7 +899,7 @@
               </wp:anchor>
             </w:drawing>
           </mc:Choice>
-          <mc:Fallback xmlns:w16sdtfl="http://schemas.microsoft.com/office/word/2024/wordml/sdtformatlock" xmlns:w16du="http://schemas.microsoft.com/office/word/2023/wordml/word16du">
+          <mc:Fallback xmlns:w16du="http://schemas.microsoft.com/office/word/2023/wordml/word16du" xmlns:w16sdtfl="http://schemas.microsoft.com/office/word/2024/wordml/sdtformatlock">
             <w:pict>
               <v:shape w14:anchorId="62480848" id="FreeForm 20" o:spid="_x0000_s1026" style="position:absolute;margin-left:421.35pt;margin-top:7.6pt;width:14.45pt;height:3.05pt;rotation:-90;z-index:251653632;visibility:visible;mso-wrap-style:square;mso-width-percent:0;mso-height-percent:0;mso-wrap-distance-left:9pt;mso-wrap-distance-top:0;mso-wrap-distance-right:9pt;mso-wrap-distance-bottom:0;mso-position-horizontal:absolute;mso-position-horizontal-relative:text;mso-position-vertical:absolute;mso-position-vertical-relative:text;mso-width-percent:0;mso-height-percent:0;mso-width-relative:page;mso-height-relative:page;v-text-anchor:top" coordsize="167,93" o:gfxdata="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" path="m8,56r32,l71,18,87,r16,l159,74r8,l151,93,103,56r-16,l56,93,16,74,,56r8,xe" strokecolor="white" strokeweight="1.5pt">
                 <v:path arrowok="t" o:connecttype="custom" o:connectlocs="9660361,9714571;48302906,9714571;85736670,3122541;105058491,0;124379214,0;192002843,12837112;201663205,12837112;182342482,16133336;124379214,9714571;105058491,9714571;67623629,16133336;19320723,12837112;0,9714571;0,9714571;9660361,9714571" o:connectangles="0,0,0,0,0,0,0,0,0,0,0,0,0,0,0"/>
@@ -1164,7 +1167,7 @@
               </wp:anchor>
             </w:drawing>
           </mc:Choice>
-          <mc:Fallback xmlns:w16sdtfl="http://schemas.microsoft.com/office/word/2024/wordml/sdtformatlock" xmlns:w16du="http://schemas.microsoft.com/office/word/2023/wordml/word16du">
+          <mc:Fallback xmlns:w16du="http://schemas.microsoft.com/office/word/2023/wordml/word16du" xmlns:w16sdtfl="http://schemas.microsoft.com/office/word/2024/wordml/sdtformatlock">
             <w:pict>
               <v:shape w14:anchorId="151C1FF4" id="FreeForm 19" o:spid="_x0000_s1026" style="position:absolute;margin-left:10.25pt;margin-top:3.85pt;width:22.65pt;height:20.25pt;rotation:-90;z-index:251647488;visibility:visible;mso-wrap-style:square;mso-width-percent:0;mso-height-percent:0;mso-wrap-distance-left:9pt;mso-wrap-distance-top:0;mso-wrap-distance-right:9pt;mso-wrap-distance-bottom:0;mso-position-horizontal:absolute;mso-position-horizontal-relative:text;mso-position-vertical:absolute;mso-position-vertical-relative:text;mso-width-percent:0;mso-height-percent:0;mso-width-relative:page;mso-height-relative:page;v-text-anchor:top" coordsize="263,613" o:gfxdata="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" path="m,595l16,576,48,502,128,316,207,112,239,38,255,r8,19l263,75,239,223r,75l247,372r,18l239,390r-48,l136,446,72,520,24,595,,613,,595xe" strokecolor="white" strokeweight="1.5pt">
                 <v:path arrowok="t" o:connecttype="custom" o:connectlocs="0,104725604;19140542,101381490;57421625,88357023;153123241,55619023;247629393,19713114;285910476,6688228;305051018,0;314621289,3344114;314621289,13200671;285910476,39250023;285910476,52450694;295480747,65475580;295480747,68643909;285910476,68643909;228488851,68643909;162693512,78500466;86132438,91524933;28710813,104725604;0,107893933;0,104725604" o:connectangles="0,0,0,0,0,0,0,0,0,0,0,0,0,0,0,0,0,0,0,0"/>
@@ -1387,7 +1390,7 @@
               </wp:anchor>
             </w:drawing>
           </mc:Choice>
-          <mc:Fallback xmlns:w16sdtfl="http://schemas.microsoft.com/office/word/2024/wordml/sdtformatlock" xmlns:w16du="http://schemas.microsoft.com/office/word/2023/wordml/word16du">
+          <mc:Fallback xmlns:w16du="http://schemas.microsoft.com/office/word/2023/wordml/word16du" xmlns:w16sdtfl="http://schemas.microsoft.com/office/word/2024/wordml/sdtformatlock">
             <w:pict>
               <v:shape w14:anchorId="4BD2B0F0" id="FreeForm 18" o:spid="_x0000_s1026" style="position:absolute;margin-left:26pt;margin-top:7.6pt;width:14.45pt;height:3.05pt;rotation:-90;z-index:251646464;visibility:visible;mso-wrap-style:square;mso-width-percent:0;mso-height-percent:0;mso-wrap-distance-left:9pt;mso-wrap-distance-top:0;mso-wrap-distance-right:9pt;mso-wrap-distance-bottom:0;mso-position-horizontal:absolute;mso-position-horizontal-relative:text;mso-position-vertical:absolute;mso-position-vertical-relative:text;mso-width-percent:0;mso-height-percent:0;mso-width-relative:page;mso-height-relative:page;v-text-anchor:top" coordsize="167,93" o:gfxdata="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" path="m8,19r32,l71,75,87,93,103,75,159,19,167,,151,,103,19r-16,l56,,16,,,19,,37,8,19xe" strokecolor="white" strokeweight="1.5pt">
                 <v:path arrowok="t" o:connecttype="custom" o:connectlocs="9660361,3296224;48302906,3296224;85736670,13010795;105058491,16133336;124379214,13010795;192002843,3296224;201663205,0;182342482,0;124379214,3296224;105058491,3296224;67623629,0;19320723,0;0,3296224;0,6418764;9660361,3296224" o:connectangles="0,0,0,0,0,0,0,0,0,0,0,0,0,0,0"/>
@@ -1613,7 +1616,7 @@
               </wp:anchor>
             </w:drawing>
           </mc:Choice>
-          <mc:Fallback xmlns:w16sdtfl="http://schemas.microsoft.com/office/word/2024/wordml/sdtformatlock" xmlns:w16du="http://schemas.microsoft.com/office/word/2023/wordml/word16du">
+          <mc:Fallback xmlns:w16du="http://schemas.microsoft.com/office/word/2023/wordml/word16du" xmlns:w16sdtfl="http://schemas.microsoft.com/office/word/2024/wordml/sdtformatlock">
             <w:pict>
               <v:shape w14:anchorId="5EC44B68" id="FreeForm 17" o:spid="_x0000_s1026" style="position:absolute;margin-left:444.15pt;margin-top:9.1pt;width:4.1pt;height:14.05pt;rotation:-90;z-index:251655680;visibility:visible;mso-wrap-style:square;mso-width-percent:0;mso-height-percent:0;mso-wrap-distance-left:9pt;mso-wrap-distance-top:0;mso-wrap-distance-right:9pt;mso-wrap-distance-bottom:0;mso-position-horizontal:absolute;mso-position-horizontal-relative:text;mso-position-vertical:absolute;mso-position-vertical-relative:text;mso-width-percent:0;mso-height-percent:0;mso-width-relative:page;mso-height-relative:page;v-text-anchor:top" coordsize="48,427" o:gfxdata="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" path="m16,409l,335,,297,8,260r8,-93l16,56,8,19,16,r8,19l40,112r8,111l40,335,24,427,16,409xe" strokecolor="white" strokeweight="1.5pt">
                 <v:path arrowok="t" o:connecttype="custom" o:connectlocs="18828729,71421221;0,58499100;0,51863574;9413822,45402305;18828729,29162213;18828729,9778823;9413822,3317972;18828729,0;18828729,0;28242551,3317972;47071280,19558064;56485102,38941036;47071280,58499100;28242551,74564518;28242551,74564518;18828729,71421221" o:connectangles="0,0,0,0,0,0,0,0,0,0,0,0,0,0,0,0"/>
@@ -1845,7 +1848,7 @@
               </wp:anchor>
             </w:drawing>
           </mc:Choice>
-          <mc:Fallback xmlns:w16sdtfl="http://schemas.microsoft.com/office/word/2024/wordml/sdtformatlock" xmlns:w16du="http://schemas.microsoft.com/office/word/2023/wordml/word16du">
+          <mc:Fallback xmlns:w16du="http://schemas.microsoft.com/office/word/2023/wordml/word16du" xmlns:w16sdtfl="http://schemas.microsoft.com/office/word/2024/wordml/sdtformatlock">
             <w:pict>
               <v:shape w14:anchorId="2784E679" id="FreeForm 16" o:spid="_x0000_s1026" style="position:absolute;margin-left:388.35pt;margin-top:13.35pt;width:17.95pt;height:6.75pt;rotation:-90;z-index:251652608;visibility:visible;mso-wrap-style:square;mso-width-percent:0;mso-height-percent:0;mso-wrap-distance-left:9pt;mso-wrap-distance-top:0;mso-wrap-distance-right:9pt;mso-wrap-distance-bottom:0;mso-position-horizontal:absolute;mso-position-horizontal-relative:text;mso-position-vertical:absolute;mso-position-vertical-relative:text;mso-width-percent:0;mso-height-percent:0;mso-width-relative:page;mso-height-relative:page;v-text-anchor:top" coordsize="208,204" o:gfxdata="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" path="m16,93l48,37,96,r48,l192,37r16,37l208,93r-8,l184,93r-72,18l72,130,40,186,24,204,8,186,,149,16,93xe" strokecolor="white" strokeweight="1.5pt">
                 <v:path arrowok="t" o:connecttype="custom" o:connectlocs="19219203,16422641;57656513,6533590;115314122,0;172970636,0;230627149,6533590;249846352,13067179;249846352,16422641;240236751,16422641;221017547,16422641;134532230,19600769;86485318,22956231;48046912,32844861;28828805,36023410;9609602,32844861;0,26311272;19219203,16422641" o:connectangles="0,0,0,0,0,0,0,0,0,0,0,0,0,0,0,0"/>
@@ -2071,7 +2074,7 @@
               </wp:anchor>
             </w:drawing>
           </mc:Choice>
-          <mc:Fallback xmlns:w16sdtfl="http://schemas.microsoft.com/office/word/2024/wordml/sdtformatlock" xmlns:w16du="http://schemas.microsoft.com/office/word/2023/wordml/word16du">
+          <mc:Fallback xmlns:w16du="http://schemas.microsoft.com/office/word/2023/wordml/word16du" xmlns:w16sdtfl="http://schemas.microsoft.com/office/word/2024/wordml/sdtformatlock">
             <w:pict>
               <v:shape w14:anchorId="2722CD0D" id="FreeForm 15" o:spid="_x0000_s1026" style="position:absolute;margin-left:13pt;margin-top:8.8pt;width:4.1pt;height:14.65pt;rotation:-90;z-index:251648512;visibility:visible;mso-wrap-style:square;mso-width-percent:0;mso-height-percent:0;mso-wrap-distance-left:9pt;mso-wrap-distance-top:0;mso-wrap-distance-right:9pt;mso-wrap-distance-bottom:0;mso-position-horizontal:absolute;mso-position-horizontal-relative:text;mso-position-vertical:absolute;mso-position-vertical-relative:text;mso-width-percent:0;mso-height-percent:0;mso-width-relative:page;mso-height-relative:page;v-text-anchor:top" coordsize="48,446" o:gfxdata="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" path="m16,19l,111r,38l8,186r8,74l16,390,8,427r8,19l24,427,40,334,48,223,40,111,24,,16,19xe" strokecolor="white" strokeweight="1.5pt">
                 <v:path arrowok="t" o:connecttype="custom" o:connectlocs="18828729,3306439;0,19316764;0,25929643;9413822,32368564;18828729,45246824;18828729,67870027;9413822,74308949;18828729,77615388;18828729,77615388;28242551,74308949;47071280,58124667;56485102,38807903;47071280,19316764;28242551,0;28242551,0;18828729,3306439" o:connectangles="0,0,0,0,0,0,0,0,0,0,0,0,0,0,0,0"/>
@@ -2303,7 +2306,7 @@
               </wp:anchor>
             </w:drawing>
           </mc:Choice>
-          <mc:Fallback xmlns:w16sdtfl="http://schemas.microsoft.com/office/word/2024/wordml/sdtformatlock" xmlns:w16du="http://schemas.microsoft.com/office/word/2023/wordml/word16du">
+          <mc:Fallback xmlns:w16du="http://schemas.microsoft.com/office/word/2023/wordml/word16du" xmlns:w16sdtfl="http://schemas.microsoft.com/office/word/2024/wordml/sdtformatlock">
             <w:pict>
               <v:shape w14:anchorId="27C0B3DC" id="FreeForm 14" o:spid="_x0000_s1026" style="position:absolute;margin-left:54.9pt;margin-top:13.35pt;width:17.95pt;height:6.75pt;rotation:-90;z-index:251645440;visibility:visible;mso-wrap-style:square;mso-width-percent:0;mso-height-percent:0;mso-wrap-distance-left:9pt;mso-wrap-distance-top:0;mso-wrap-distance-right:9pt;mso-wrap-distance-bottom:0;mso-position-horizontal:absolute;mso-position-horizontal-relative:text;mso-position-vertical:absolute;mso-position-vertical-relative:text;mso-width-percent:0;mso-height-percent:0;mso-width-relative:page;mso-height-relative:page;v-text-anchor:top" coordsize="208,204" o:gfxdata="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" path="m16,130r32,56l96,204r48,l192,167r16,-18l208,130r-8,l184,130,112,112,72,74,40,19,24,,8,37,,74r16,56xe" strokecolor="white" strokeweight="1.5pt">
                 <v:path arrowok="t" o:connecttype="custom" o:connectlocs="19219203,22956231;57656513,32844861;115314122,36023410;172970636,36023410;230627149,29489820;249846352,26311272;249846352,22956231;240236751,22956231;221017547,22956231;134532230,19777682;86485318,13067179;48046912,3355041;28828805,0;9609602,6533590;0,13067179;19219203,22956231" o:connectangles="0,0,0,0,0,0,0,0,0,0,0,0,0,0,0,0"/>
@@ -2758,6 +2761,12 @@
               </w:rPr>
               <w:t>Trưởng nhóm</w:t>
             </w:r>
+            <w:r>
+              <w:rPr>
+                <w:szCs w:val="22"/>
+              </w:rPr>
+              <w:t xml:space="preserve"> </w:t>
+            </w:r>
           </w:p>
           <w:p>
             <w:pPr>
@@ -2773,37 +2782,7 @@
               <w:rPr>
                 <w:szCs w:val="22"/>
               </w:rPr>
-              <w:t>-</w:t>
-            </w:r>
-            <w:r>
-              <w:rPr>
-                <w:szCs w:val="22"/>
-              </w:rPr>
-              <w:t xml:space="preserve"> </w:t>
-            </w:r>
-            <w:r>
-              <w:rPr>
-                <w:szCs w:val="22"/>
-              </w:rPr>
-              <w:t>Nguyễn Bá Gia Huy</w:t>
-            </w:r>
-            <w:r>
-              <w:rPr>
-                <w:szCs w:val="22"/>
-              </w:rPr>
-              <w:t xml:space="preserve">, </w:t>
-            </w:r>
-            <w:r>
-              <w:rPr>
-                <w:szCs w:val="22"/>
-              </w:rPr>
-              <w:t>PS48224</w:t>
-            </w:r>
-            <w:r>
-              <w:rPr>
-                <w:szCs w:val="22"/>
-              </w:rPr>
-              <w:t>, Vai trò</w:t>
+              <w:t>(Data Analyst)</w:t>
             </w:r>
           </w:p>
           <w:p>
@@ -2832,7 +2811,7 @@
               <w:rPr>
                 <w:szCs w:val="22"/>
               </w:rPr>
-              <w:t>Đỗ Trọng Thái</w:t>
+              <w:t>Nguyễn Bá Gia Huy</w:t>
             </w:r>
             <w:r>
               <w:rPr>
@@ -2844,13 +2823,19 @@
               <w:rPr>
                 <w:szCs w:val="22"/>
               </w:rPr>
-              <w:t>PS47694</w:t>
+              <w:t>PS48224</w:t>
             </w:r>
             <w:r>
               <w:rPr>
                 <w:szCs w:val="22"/>
               </w:rPr>
-              <w:t>, Vai trò</w:t>
+              <w:t xml:space="preserve">, </w:t>
+            </w:r>
+            <w:r>
+              <w:rPr>
+                <w:szCs w:val="22"/>
+              </w:rPr>
+              <w:t>ML Engineer</w:t>
             </w:r>
           </w:p>
           <w:p>
@@ -2879,6 +2864,59 @@
               <w:rPr>
                 <w:szCs w:val="22"/>
               </w:rPr>
+              <w:t>Đỗ Trọng Thái</w:t>
+            </w:r>
+            <w:r>
+              <w:rPr>
+                <w:szCs w:val="22"/>
+              </w:rPr>
+              <w:t xml:space="preserve">, </w:t>
+            </w:r>
+            <w:r>
+              <w:rPr>
+                <w:szCs w:val="22"/>
+              </w:rPr>
+              <w:t>PS47694</w:t>
+            </w:r>
+            <w:r>
+              <w:rPr>
+                <w:szCs w:val="22"/>
+              </w:rPr>
+              <w:t>,</w:t>
+            </w:r>
+            <w:r>
+              <w:rPr>
+                <w:szCs w:val="22"/>
+              </w:rPr>
+              <w:t xml:space="preserve"> Data Engineer</w:t>
+            </w:r>
+          </w:p>
+          <w:p>
+            <w:pPr>
+              <w:tabs>
+                <w:tab w:val="left" w:pos="2860"/>
+                <w:tab w:val="left" w:pos="5590"/>
+              </w:tabs>
+              <w:rPr>
+                <w:szCs w:val="22"/>
+              </w:rPr>
+            </w:pPr>
+            <w:r>
+              <w:rPr>
+                <w:szCs w:val="22"/>
+              </w:rPr>
+              <w:t>-</w:t>
+            </w:r>
+            <w:r>
+              <w:rPr>
+                <w:szCs w:val="22"/>
+              </w:rPr>
+              <w:t xml:space="preserve"> </w:t>
+            </w:r>
+            <w:r>
+              <w:rPr>
+                <w:szCs w:val="22"/>
+              </w:rPr>
               <w:t>Đặng Trịnh Qui Anh</w:t>
             </w:r>
             <w:r>
@@ -2903,7 +2941,13 @@
               <w:rPr>
                 <w:szCs w:val="22"/>
               </w:rPr>
-              <w:t>Vai trò</w:t>
+              <w:t xml:space="preserve"> </w:t>
+            </w:r>
+            <w:r>
+              <w:rPr>
+                <w:szCs w:val="22"/>
+              </w:rPr>
+              <w:t>Data Engineer</w:t>
             </w:r>
           </w:p>
           <w:p>
@@ -2950,7 +2994,7 @@
               <w:rPr>
                 <w:szCs w:val="22"/>
               </w:rPr>
-              <w:t>Vai trò</w:t>
+              <w:t>Tester</w:t>
             </w:r>
           </w:p>
         </w:tc>
@@ -3202,7 +3246,7 @@
               </wp:anchor>
             </w:drawing>
           </mc:Choice>
-          <mc:Fallback xmlns:w16sdtfl="http://schemas.microsoft.com/office/word/2024/wordml/sdtformatlock" xmlns:w16du="http://schemas.microsoft.com/office/word/2023/wordml/word16du">
+          <mc:Fallback xmlns:w16du="http://schemas.microsoft.com/office/word/2023/wordml/word16du" xmlns:w16sdtfl="http://schemas.microsoft.com/office/word/2024/wordml/sdtformatlock">
             <w:pict>
               <v:shape w14:anchorId="1FCF3E9A" id="FreeForm 13" o:spid="_x0000_s1026" style="position:absolute;margin-left:432.55pt;margin-top:7.25pt;width:6.95pt;height:14.1pt;rotation:-90;z-index:251663872;visibility:visible;mso-wrap-style:square;mso-width-percent:0;mso-height-percent:0;mso-wrap-distance-left:9pt;mso-wrap-distance-top:0;mso-wrap-distance-right:9pt;mso-wrap-distance-bottom:0;mso-position-horizontal:absolute;mso-position-horizontal-relative:text;mso-position-vertical:absolute;mso-position-vertical-relative:text;mso-width-percent:0;mso-height-percent:0;mso-width-relative:page;mso-height-relative:page;v-text-anchor:top" coordsize="80,427" o:gfxdata="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" path="m8,l24,,56,55r16,56l80,204r-8,93l40,408,24,427r-8,l16,408r8,-37l32,297r,-56l16,148,,74,8,xe" strokecolor="white" strokeweight="1.5pt">
                 <v:path arrowok="t" o:connecttype="custom" o:connectlocs="9738939,0;29215715,0;68169266,9672716;87646042,19521566;97383878,35877325;87646042,52233083;48692491,71754649;29215715,75096171;19476776,75096171;19476776,71754649;29215715,65247321;38953551,52233083;38953551,42384653;19476776,26028475;0,13014237;9738939,0" o:connectangles="0,0,0,0,0,0,0,0,0,0,0,0,0,0,0,0"/>
@@ -3495,7 +3539,7 @@
               </wp:anchor>
             </w:drawing>
           </mc:Choice>
-          <mc:Fallback xmlns:w16sdtfl="http://schemas.microsoft.com/office/word/2024/wordml/sdtformatlock" xmlns:w16du="http://schemas.microsoft.com/office/word/2023/wordml/word16du">
+          <mc:Fallback xmlns:w16du="http://schemas.microsoft.com/office/word/2023/wordml/word16du" xmlns:w16sdtfl="http://schemas.microsoft.com/office/word/2024/wordml/sdtformatlock">
             <w:pict>
               <v:shape w14:anchorId="701594E3" id="FreeForm 12" o:spid="_x0000_s1026" style="position:absolute;margin-left:395.8pt;margin-top:12.85pt;width:23.35pt;height:20.8pt;rotation:-90;z-index:251656704;visibility:visible;mso-wrap-style:square;mso-width-percent:0;mso-height-percent:0;mso-wrap-distance-left:9pt;mso-wrap-distance-top:0;mso-wrap-distance-right:9pt;mso-wrap-distance-bottom:0;mso-position-horizontal:absolute;mso-position-horizontal-relative:text;mso-position-vertical:absolute;mso-position-vertical-relative:text;mso-width-percent:0;mso-height-percent:0;mso-width-relative:page;mso-height-relative:page;v-text-anchor:top" coordsize="271,631" o:gfxdata="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" path="m120,56l80,37r-32,l48,93,64,204,56,371,40,483,8,594,,631r8,l24,594,56,520,144,334,231,130,255,56,271,18,271,r-8,l223,18,183,37,144,74r-8,l120,56xe" strokecolor="white" strokeweight="1.5pt">
                 <v:path arrowok="t" o:connecttype="custom" o:connectlocs="143688637,9814528;95792789,6484688;57476111,6484688;57476111,16298798;76634450,35752444;67055281,65020200;47895847,84649256;9579169,104102484;0,110587172;9579169,110587172;28737508,104102484;67055281,91133525;172427239,58535930;276602075,22783486;305339584,9814528;324497923,3154430;324497923,0;314918753,0;267021811,3154430;219125964,6484688;172427239,12968958;162848070,12968958;143688637,9814528" o:connectangles="0,0,0,0,0,0,0,0,0,0,0,0,0,0,0,0,0,0,0,0,0,0,0"/>
@@ -3725,7 +3769,7 @@
               </wp:anchor>
             </w:drawing>
           </mc:Choice>
-          <mc:Fallback xmlns:w16sdtfl="http://schemas.microsoft.com/office/word/2024/wordml/sdtformatlock" xmlns:w16du="http://schemas.microsoft.com/office/word/2023/wordml/word16du">
+          <mc:Fallback xmlns:w16du="http://schemas.microsoft.com/office/word/2023/wordml/word16du" xmlns:w16sdtfl="http://schemas.microsoft.com/office/word/2024/wordml/sdtformatlock">
             <w:pict>
               <v:shape w14:anchorId="405E6262" id="FreeForm 11" o:spid="_x0000_s1026" style="position:absolute;margin-left:21.85pt;margin-top:7.25pt;width:6.95pt;height:14.1pt;rotation:-90;z-index:251651584;visibility:visible;mso-wrap-style:square;mso-width-percent:0;mso-height-percent:0;mso-wrap-distance-left:9pt;mso-wrap-distance-top:0;mso-wrap-distance-right:9pt;mso-wrap-distance-bottom:0;mso-position-horizontal:absolute;mso-position-horizontal-relative:text;mso-position-vertical:absolute;mso-position-vertical-relative:text;mso-width-percent:0;mso-height-percent:0;mso-width-relative:page;mso-height-relative:page;v-text-anchor:top" coordsize="80,427" o:gfxdata="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" path="m8,427r16,l56,390,72,315r8,-74l72,148,40,37,24,,16,r,18l24,74r8,56l32,185,16,297,,371r8,56xe" strokecolor="white" strokeweight="1.5pt">
                 <v:path arrowok="t" o:connecttype="custom" o:connectlocs="9738939,75096171;29215715,75096171;68169266,68588842;87646042,55398890;97383878,42384653;87646042,26028475;48692491,6507328;29215715,0;19476776,0;19476776,3165807;29215715,13014237;38953551,22863087;38953551,32535803;19476776,52233083;0,65247321;9738939,75096171" o:connectangles="0,0,0,0,0,0,0,0,0,0,0,0,0,0,0,0"/>
@@ -4056,7 +4100,7 @@
               </wp:anchor>
             </w:drawing>
           </mc:Choice>
-          <mc:Fallback xmlns:w16sdtfl="http://schemas.microsoft.com/office/word/2024/wordml/sdtformatlock" xmlns:w16du="http://schemas.microsoft.com/office/word/2023/wordml/word16du">
+          <mc:Fallback xmlns:w16du="http://schemas.microsoft.com/office/word/2023/wordml/word16du" xmlns:w16sdtfl="http://schemas.microsoft.com/office/word/2024/wordml/sdtformatlock">
             <w:pict>
               <v:shape w14:anchorId="41CF14AA" id="FreeForm 10" o:spid="_x0000_s1026" style="position:absolute;margin-left:412.8pt;margin-top:6.55pt;width:19.9pt;height:6.1pt;rotation:-90;z-index:251662848;visibility:visible;mso-wrap-style:square;mso-width-percent:0;mso-height-percent:0;mso-wrap-distance-left:9pt;mso-wrap-distance-top:0;mso-wrap-distance-right:9pt;mso-wrap-distance-bottom:0;mso-position-horizontal:absolute;mso-position-horizontal-relative:text;mso-position-vertical:absolute;mso-position-vertical-relative:text;mso-width-percent:0;mso-height-percent:0;mso-width-relative:page;mso-height-relative:page;v-text-anchor:top" coordsize="231,186" o:gfxdata="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" path="m,167l48,93,112,19,175,r24,l223,37r8,37l223,111r-8,19l207,111,160,74,104,93,48,130,8,186r-8,l,167xe" strokecolor="white" strokeweight="1.5pt">
                 <v:path arrowok="t" o:connecttype="custom" o:connectlocs="0,28970448;57455047,16133336;134062871,3296224;209472689,0;238200760,0;266927737,6418764;276504125,12837112;266927737,19255877;257352443,22552100;247776054,19255877;191517919,12837112;124486483,16133336;57455047,22552100;9576388,32266672;0,32266672;0,28970448" o:connectangles="0,0,0,0,0,0,0,0,0,0,0,0,0,0,0,0"/>
@@ -4288,7 +4332,7 @@
               </wp:anchor>
             </w:drawing>
           </mc:Choice>
-          <mc:Fallback xmlns:w16sdtfl="http://schemas.microsoft.com/office/word/2024/wordml/sdtformatlock" xmlns:w16du="http://schemas.microsoft.com/office/word/2023/wordml/word16du">
+          <mc:Fallback xmlns:w16du="http://schemas.microsoft.com/office/word/2023/wordml/word16du" xmlns:w16sdtfl="http://schemas.microsoft.com/office/word/2024/wordml/sdtformatlock">
             <w:pict>
               <v:shape w14:anchorId="2DDF7FF9" id="FreeForm 9" o:spid="_x0000_s1026" style="position:absolute;margin-left:444.6pt;margin-top:8.55pt;width:3.45pt;height:14.05pt;rotation:-90;z-index:251661824;visibility:visible;mso-wrap-style:square;mso-width-percent:0;mso-height-percent:0;mso-wrap-distance-left:9pt;mso-wrap-distance-top:0;mso-wrap-distance-right:9pt;mso-wrap-distance-bottom:0;mso-position-horizontal:absolute;mso-position-horizontal-relative:text;mso-position-vertical:absolute;mso-position-vertical-relative:text;mso-width-percent:0;mso-height-percent:0;mso-width-relative:page;mso-height-relative:page;v-text-anchor:top" coordsize="40,427" o:gfxdata="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" path="m24,409l40,335r,-38l32,260,24,167,32,56r,-37l32,,24,,16,19,,112,,223,,335r16,92l24,427r,-18xe" strokecolor="white" strokeweight="1.5pt">
                 <v:path arrowok="t" o:connecttype="custom" o:connectlocs="28796313,71421221;47993856,58499100;47993856,51863574;38395085,45402305;28796313,29162213;38395085,9778823;38395085,3317972;38395085,0;28796313,0;19197542,3317972;0,19558064;0,38941036;0,58499100;19197542,74564518;28796313,74564518;28796313,71421221" o:connectangles="0,0,0,0,0,0,0,0,0,0,0,0,0,0,0,0"/>
@@ -4556,7 +4600,7 @@
               </wp:anchor>
             </w:drawing>
           </mc:Choice>
-          <mc:Fallback xmlns:w16sdtfl="http://schemas.microsoft.com/office/word/2024/wordml/sdtformatlock" xmlns:w16du="http://schemas.microsoft.com/office/word/2023/wordml/word16du">
+          <mc:Fallback xmlns:w16du="http://schemas.microsoft.com/office/word/2023/wordml/word16du" xmlns:w16sdtfl="http://schemas.microsoft.com/office/word/2024/wordml/sdtformatlock">
             <w:pict>
               <v:shape w14:anchorId="332B4940" id="FreeForm 8" o:spid="_x0000_s1026" style="position:absolute;margin-left:428.6pt;margin-top:16.75pt;width:22pt;height:20.2pt;rotation:-90;z-index:251660800;visibility:visible;mso-wrap-style:square;mso-width-percent:0;mso-height-percent:0;mso-wrap-distance-left:9pt;mso-wrap-distance-top:0;mso-wrap-distance-right:9pt;mso-wrap-distance-bottom:0;mso-position-horizontal:absolute;mso-position-horizontal-relative:text;mso-position-vertical:absolute;mso-position-vertical-relative:text;mso-width-percent:0;mso-height-percent:0;mso-width-relative:page;mso-height-relative:page;v-text-anchor:top" coordsize="255,613" o:gfxdata="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" path="m255,19r-8,37l215,130,135,316,48,502,16,576,,613,,594,,557,16,390r,-74l8,260r,-18l16,242,64,223r63,-56l191,93,231,19,255,r,19xe" strokecolor="white" strokeweight="1.5pt">
                 <v:path arrowok="t" o:connecttype="custom" o:connectlocs="306134745,3327487;296531055,9807947;258114103,22768448;162071722,55344843;57625428,87921238;19208476,100881739;0,107361781;0,104034294;0,97553834;19208476,68305344;19208476,55344843;9603690,45536896;9603690,42384342;19208476,42384342;76833904,39056436;152466936,29248489;229300841,16287988;277322579,3327487;306134745,0;306134745,3327487" o:connectangles="0,0,0,0,0,0,0,0,0,0,0,0,0,0,0,0,0,0,0,0"/>
@@ -4776,7 +4820,7 @@
               </wp:anchor>
             </w:drawing>
           </mc:Choice>
-          <mc:Fallback xmlns:w16sdtfl="http://schemas.microsoft.com/office/word/2024/wordml/sdtformatlock" xmlns:w16du="http://schemas.microsoft.com/office/word/2023/wordml/word16du">
+          <mc:Fallback xmlns:w16du="http://schemas.microsoft.com/office/word/2023/wordml/word16du" xmlns:w16sdtfl="http://schemas.microsoft.com/office/word/2024/wordml/sdtformatlock">
             <w:pict>
               <v:shape w14:anchorId="2BF9838A" id="FreeForm 7" o:spid="_x0000_s1026" style="position:absolute;margin-left:421.4pt;margin-top:29.8pt;width:14.35pt;height:3.05pt;rotation:-90;z-index:251659776;visibility:visible;mso-wrap-style:square;mso-width-percent:0;mso-height-percent:0;mso-wrap-distance-left:9pt;mso-wrap-distance-top:0;mso-wrap-distance-right:9pt;mso-wrap-distance-bottom:0;mso-position-horizontal:absolute;mso-position-horizontal-relative:text;mso-position-vertical:absolute;mso-position-vertical-relative:text;mso-width-percent:0;mso-height-percent:0;mso-width-relative:page;mso-height-relative:page;v-text-anchor:top" coordsize="167,93" o:gfxdata="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" path="m151,56r-32,l88,18,72,,56,,,74,8,93,64,56r16,l111,93,151,74r8,-18l167,56r-16,xe" strokecolor="white" strokeweight="1.5pt">
                 <v:path arrowok="t" o:connecttype="custom" o:connectlocs="179826707,9714571;141717859,9714571;104799605,3122541;85745727,0;66690757,0;0,12837112;0,12837112;9526939,16133336;76217696,9714571;95272666,9714571;132190920,16133336;179826707,12837112;189354738,9714571;198881677,9714571;179826707,9714571" o:connectangles="0,0,0,0,0,0,0,0,0,0,0,0,0,0,0"/>
@@ -5008,7 +5052,7 @@
               </wp:anchor>
             </w:drawing>
           </mc:Choice>
-          <mc:Fallback xmlns:w16sdtfl="http://schemas.microsoft.com/office/word/2024/wordml/sdtformatlock" xmlns:w16du="http://schemas.microsoft.com/office/word/2023/wordml/word16du">
+          <mc:Fallback xmlns:w16du="http://schemas.microsoft.com/office/word/2023/wordml/word16du" xmlns:w16sdtfl="http://schemas.microsoft.com/office/word/2024/wordml/sdtformatlock">
             <w:pict>
               <v:shape w14:anchorId="40CEFC85" id="FreeForm 6" o:spid="_x0000_s1026" style="position:absolute;margin-left:388.4pt;margin-top:11.85pt;width:17.95pt;height:6.75pt;rotation:-90;z-index:251658752;visibility:visible;mso-wrap-style:square;mso-width-percent:0;mso-height-percent:0;mso-wrap-distance-left:9pt;mso-wrap-distance-top:0;mso-wrap-distance-right:9pt;mso-wrap-distance-bottom:0;mso-position-horizontal:absolute;mso-position-horizontal-relative:text;mso-position-vertical:absolute;mso-position-vertical-relative:text;mso-width-percent:0;mso-height-percent:0;mso-width-relative:page;mso-height-relative:page;v-text-anchor:top" coordsize="208,204" o:gfxdata="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" path="m200,93l160,37,112,,64,,16,37,,74,,93r8,l32,93r72,18l136,130r32,56l184,204r16,-18l208,149,200,93xe" strokecolor="white" strokeweight="1.5pt">
                 <v:path arrowok="t" o:connecttype="custom" o:connectlocs="240236751,16422641;192189839,6533590;134532230,0;76875716,0;19219203,6533590;0,13067179;0,16422641;9609602,16422641;38438406,16422641;124923724,19600769;163361034,22956231;201799440,32844861;221017547,36023410;240236751,32844861;249846352,26311272;240236751,16422641" o:connectangles="0,0,0,0,0,0,0,0,0,0,0,0,0,0,0,0"/>
@@ -5231,7 +5275,7 @@
               </wp:anchor>
             </w:drawing>
           </mc:Choice>
-          <mc:Fallback xmlns:w16sdtfl="http://schemas.microsoft.com/office/word/2024/wordml/sdtformatlock" xmlns:w16du="http://schemas.microsoft.com/office/word/2023/wordml/word16du">
+          <mc:Fallback xmlns:w16du="http://schemas.microsoft.com/office/word/2023/wordml/word16du" xmlns:w16sdtfl="http://schemas.microsoft.com/office/word/2024/wordml/sdtformatlock">
             <w:pict>
               <v:shape w14:anchorId="0498CD70" id="FreeForm 5" o:spid="_x0000_s1026" style="position:absolute;margin-left:409.3pt;margin-top:2.1pt;width:6.2pt;height:15.9pt;rotation:-90;z-index:251657728;visibility:visible;mso-wrap-style:square;mso-width-percent:0;mso-height-percent:0;mso-wrap-distance-left:9pt;mso-wrap-distance-top:0;mso-wrap-distance-right:9pt;mso-wrap-distance-bottom:0;mso-position-horizontal:absolute;mso-position-horizontal-relative:text;mso-position-vertical:absolute;mso-position-vertical-relative:text;mso-width-percent:0;mso-height-percent:0;mso-width-relative:page;mso-height-relative:page;v-text-anchor:top" coordsize="72,483" o:gfxdata="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" path="m16,483l56,353,72,223,72,93,48,,32,,8,18,,55,,93r24,92l40,297r-8,93l8,464r,19l16,483xe" strokecolor="white" strokeweight="1.5pt">
                 <v:path arrowok="t" o:connecttype="custom" o:connectlocs="19136007,84421791;66974932,61699440;86110939,38977507;86110939,16255156;57406928,0;38272014,0;9568004,3146011;0,9613206;0,16255156;28704011,32335557;47838924,51911479;38272014,68166635;9568004,81101025;9568004,84421791;19136007,84421791" o:connectangles="0,0,0,0,0,0,0,0,0,0,0,0,0,0,0"/>
@@ -5463,7 +5507,7 @@
               </wp:anchor>
             </w:drawing>
           </mc:Choice>
-          <mc:Fallback xmlns:w16sdtfl="http://schemas.microsoft.com/office/word/2024/wordml/sdtformatlock" xmlns:w16du="http://schemas.microsoft.com/office/word/2023/wordml/word16du">
+          <mc:Fallback xmlns:w16du="http://schemas.microsoft.com/office/word/2023/wordml/word16du" xmlns:w16sdtfl="http://schemas.microsoft.com/office/word/2024/wordml/sdtformatlock">
             <w:pict>
               <v:shape w14:anchorId="4C649850" id="FreeForm 4" o:spid="_x0000_s1026" style="position:absolute;margin-left:13.45pt;margin-top:8.25pt;width:3.45pt;height:14.65pt;rotation:-90;z-index:251650560;visibility:visible;mso-wrap-style:square;mso-width-percent:0;mso-height-percent:0;mso-wrap-distance-left:9pt;mso-wrap-distance-top:0;mso-wrap-distance-right:9pt;mso-wrap-distance-bottom:0;mso-position-horizontal:absolute;mso-position-horizontal-relative:text;mso-position-vertical:absolute;mso-position-vertical-relative:text;mso-width-percent:0;mso-height-percent:0;mso-width-relative:page;mso-height-relative:page;v-text-anchor:top" coordsize="40,446" o:gfxdata="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" path="m24,19r16,92l40,149r-8,37l24,260r8,130l32,427r,19l24,446,16,427,,334,,223,,111,16,r8,l24,19xe" strokecolor="white" strokeweight="1.5pt">
                 <v:path arrowok="t" o:connecttype="custom" o:connectlocs="28796313,3306439;47993856,19316764;47993856,25929643;38395085,32368564;28796313,45246824;38395085,67870027;38395085,74308949;38395085,77615388;28796313,77615388;19197542,74308949;0,58124667;0,38807903;0,19316764;19197542,0;28796313,0;28796313,3306439" o:connectangles="0,0,0,0,0,0,0,0,0,0,0,0,0,0,0,0"/>
@@ -5686,7 +5730,7 @@
               </wp:anchor>
             </w:drawing>
           </mc:Choice>
-          <mc:Fallback xmlns:w16sdtfl="http://schemas.microsoft.com/office/word/2024/wordml/sdtformatlock" xmlns:w16du="http://schemas.microsoft.com/office/word/2023/wordml/word16du">
+          <mc:Fallback xmlns:w16du="http://schemas.microsoft.com/office/word/2023/wordml/word16du" xmlns:w16sdtfl="http://schemas.microsoft.com/office/word/2024/wordml/sdtformatlock">
             <w:pict>
               <v:shape w14:anchorId="238A198E" id="FreeForm 3" o:spid="_x0000_s1026" style="position:absolute;margin-left:26.05pt;margin-top:29.8pt;width:14.35pt;height:3.05pt;rotation:-90;z-index:251649536;visibility:visible;mso-wrap-style:square;mso-width-percent:0;mso-height-percent:0;mso-wrap-distance-left:9pt;mso-wrap-distance-top:0;mso-wrap-distance-right:9pt;mso-wrap-distance-bottom:0;mso-position-horizontal:absolute;mso-position-horizontal-relative:text;mso-position-vertical:absolute;mso-position-vertical-relative:text;mso-width-percent:0;mso-height-percent:0;mso-width-relative:page;mso-height-relative:page;v-text-anchor:top" coordsize="167,93" o:gfxdata="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" path="m151,19r-32,l88,75,72,93,56,75,,19,,,8,,64,19r16,l111,r40,l159,19r8,18l151,19xe" strokecolor="white" strokeweight="1.5pt">
                 <v:path arrowok="t" o:connecttype="custom" o:connectlocs="179826707,3296224;141717859,3296224;104799605,13010795;85745727,16133336;66690757,13010795;0,3296224;0,0;9526939,0;76217696,3296224;95272666,3296224;132190920,0;179826707,0;189354738,3296224;198881677,6418764;179826707,3296224" o:connectangles="0,0,0,0,0,0,0,0,0,0,0,0,0,0,0"/>
@@ -11700,11 +11744,6 @@
       </w:r>
     </w:p>
     <w:p>
-      <w:pPr>
-        <w:rPr>
-          <w:rFonts w:hint="eastAsia"/>
-        </w:rPr>
-      </w:pPr>
       <w:r>
         <w:rPr>
           <w:rFonts w:hint="eastAsia"/>
@@ -13346,6 +13385,7 @@
   <w:style w:type="character" w:default="1" w:styleId="DefaultParagraphFont">
     <w:name w:val="Default Paragraph Font"/>
     <w:uiPriority w:val="1"/>
+    <w:semiHidden/>
     <w:unhideWhenUsed/>
   </w:style>
   <w:style w:type="table" w:default="1" w:styleId="TableNormal">

</xml_diff>